<commit_message>
Ajustes esteticos finales: formato de fecha, separacion de NIT y DV, llenado de CDP/RPC/Ciudad y nombre corto en archivos ZIP
</commit_message>
<xml_diff>
--- a/src/main/webapp/plantillas/DESIGNACION_SUPERVISOR_CON APOYO.docx
+++ b/src/main/webapp/plantillas/DESIGNACION_SUPERVISOR_CON APOYO.docx
@@ -17,7 +17,15 @@
           <w:sz w:val="24"/>
           <w:szCs w:val="24"/>
         </w:rPr>
-        <w:t>Santiago de Cali, ${RPC_FECHA}</w:t>
+        <w:t xml:space="preserve">Santiago de Cali, </w:t>
+      </w:r>
+      <w:r>
+        <w:rPr>
+          <w:rFonts w:ascii="Arial" w:eastAsia="Arial" w:hAnsi="Arial" w:cs="Arial"/>
+          <w:sz w:val="24"/>
+          <w:szCs w:val="24"/>
+        </w:rPr>
+        <w:t>${FECHA_EJECUCION_CONTRATO}</w:t>
       </w:r>
     </w:p>
     <w:p>
@@ -2043,18 +2051,7 @@
           <w:szCs w:val="24"/>
         </w:rPr>
         <w:lastRenderedPageBreak/>
-        <w:t xml:space="preserve">Copia del contrato debidamente cumplido los requisitos de perfeccionamiento </w:t>
-      </w:r>
-      <w:bookmarkStart w:id="0" w:name="_GoBack"/>
-      <w:bookmarkEnd w:id="0"/>
-      <w:r>
-        <w:rPr>
-          <w:rFonts w:ascii="Arial" w:eastAsia="Arial" w:hAnsi="Arial" w:cs="Arial"/>
-          <w:color w:val="000000"/>
-          <w:sz w:val="24"/>
-          <w:szCs w:val="24"/>
-        </w:rPr>
-        <w:t>y ejecución.</w:t>
+        <w:t>Copia del contrato debidamente cumplido los requisitos de perfeccionamiento y ejecución.</w:t>
       </w:r>
     </w:p>
     <w:p>
@@ -3125,7 +3122,15 @@
           <w:sz w:val="24"/>
           <w:szCs w:val="24"/>
         </w:rPr>
-        <w:t>Fecha: ${FECHA_RPC_SUPERVISOR}</w:t>
+        <w:t xml:space="preserve">Fecha: </w:t>
+      </w:r>
+      <w:r>
+        <w:rPr>
+          <w:rFonts w:ascii="Arial" w:eastAsia="Arial" w:hAnsi="Arial" w:cs="Arial"/>
+          <w:sz w:val="24"/>
+          <w:szCs w:val="24"/>
+        </w:rPr>
+        <w:t>${FECHA_EJECUCION_CONTRATO}</w:t>
       </w:r>
     </w:p>
     <w:p>
@@ -3215,8 +3220,18 @@
           <w:szCs w:val="24"/>
         </w:rPr>
         <w:lastRenderedPageBreak/>
-        <w:t>Fecha: ${FECHA_RPC_SUPERVISOR}</w:t>
-      </w:r>
+        <w:t xml:space="preserve">Fecha: </w:t>
+      </w:r>
+      <w:bookmarkStart w:id="0" w:name="_GoBack"/>
+      <w:r>
+        <w:rPr>
+          <w:rFonts w:ascii="Arial" w:eastAsia="Arial" w:hAnsi="Arial" w:cs="Arial"/>
+          <w:sz w:val="24"/>
+          <w:szCs w:val="24"/>
+        </w:rPr>
+        <w:t>${FECHA_EJECUCION_CONTRATO}</w:t>
+      </w:r>
+      <w:bookmarkEnd w:id="0"/>
     </w:p>
     <w:p>
       <w:pPr>
@@ -3430,7 +3445,7 @@
         <w:sz w:val="16"/>
         <w:szCs w:val="16"/>
       </w:rPr>
-      <w:t>4</w:t>
+      <w:t>6</w:t>
     </w:r>
     <w:r>
       <w:rPr>

</xml_diff>